<commit_message>
docs: update campus outreach documentation with AP master directory, safe batch engine, and live screenshots
</commit_message>
<xml_diff>
--- a/public/Shortfundly_Campus_Outreach_Documentation.docx
+++ b/public/Shortfundly_Campus_Outreach_Documentation.docx
@@ -1135,6 +1135,144 @@
                 <w:b/>
                 <w:sz w:val="18"/>
               </w:rPr>
+              <w:t>Safe Batch Engine</w:t>
+            </w:r>
+          </w:p>
+        </w:tc>
+        <w:tc>
+          <w:tcPr>
+            <w:tcW w:type="dxa" w:w="3120"/>
+            <w:tcMar>
+              <w:top w:w="80" w:type="dxa"/>
+              <w:bottom w:w="80" w:type="dxa"/>
+              <w:left w:w="120" w:type="dxa"/>
+              <w:right w:w="120" w:type="dxa"/>
+            </w:tcMar>
+            <w:tcBorders>
+              <w:bottom w:val="single" w:sz="4" w:space="0" w:color="E2E8F0"/>
+            </w:tcBorders>
+          </w:tcPr>
+          <w:p>
+            <w:r>
+              <w:rPr>
+                <w:sz w:val="18"/>
+              </w:rPr>
+              <w:t>Client-Side Safe Partitioning &amp; Pacing</w:t>
+            </w:r>
+          </w:p>
+        </w:tc>
+        <w:tc>
+          <w:tcPr>
+            <w:tcW w:type="dxa" w:w="3120"/>
+            <w:tcMar>
+              <w:top w:w="80" w:type="dxa"/>
+              <w:bottom w:w="80" w:type="dxa"/>
+              <w:left w:w="120" w:type="dxa"/>
+              <w:right w:w="120" w:type="dxa"/>
+            </w:tcMar>
+            <w:tcBorders>
+              <w:bottom w:val="single" w:sz="4" w:space="0" w:color="E2E8F0"/>
+            </w:tcBorders>
+          </w:tcPr>
+          <w:p>
+            <w:r>
+              <w:rPr>
+                <w:sz w:val="18"/>
+              </w:rPr>
+              <w:t>Auto-segments large datasets into safe batches (25/50/100/200) with anti-spam cooling intervals.</w:t>
+            </w:r>
+          </w:p>
+        </w:tc>
+      </w:tr>
+      <w:tr>
+        <w:tc>
+          <w:tcPr>
+            <w:tcW w:type="dxa" w:w="3120"/>
+            <w:tcMar>
+              <w:top w:w="80" w:type="dxa"/>
+              <w:bottom w:w="80" w:type="dxa"/>
+              <w:left w:w="120" w:type="dxa"/>
+              <w:right w:w="120" w:type="dxa"/>
+            </w:tcMar>
+            <w:tcBorders>
+              <w:bottom w:val="single" w:sz="4" w:space="0" w:color="E2E8F0"/>
+            </w:tcBorders>
+          </w:tcPr>
+          <w:p>
+            <w:r>
+              <w:rPr>
+                <w:b/>
+                <w:sz w:val="18"/>
+              </w:rPr>
+              <w:t>Statewide Data Pipeline</w:t>
+            </w:r>
+          </w:p>
+        </w:tc>
+        <w:tc>
+          <w:tcPr>
+            <w:tcW w:type="dxa" w:w="3120"/>
+            <w:tcMar>
+              <w:top w:w="80" w:type="dxa"/>
+              <w:bottom w:w="80" w:type="dxa"/>
+              <w:left w:w="120" w:type="dxa"/>
+              <w:right w:w="120" w:type="dxa"/>
+            </w:tcMar>
+            <w:tcBorders>
+              <w:bottom w:val="single" w:sz="4" w:space="0" w:color="E2E8F0"/>
+            </w:tcBorders>
+          </w:tcPr>
+          <w:p>
+            <w:r>
+              <w:rPr>
+                <w:sz w:val="18"/>
+              </w:rPr>
+              <w:t>Python (Playwright &amp; BeautifulSoup)</w:t>
+            </w:r>
+          </w:p>
+        </w:tc>
+        <w:tc>
+          <w:tcPr>
+            <w:tcW w:type="dxa" w:w="3120"/>
+            <w:tcMar>
+              <w:top w:w="80" w:type="dxa"/>
+              <w:bottom w:w="80" w:type="dxa"/>
+              <w:left w:w="120" w:type="dxa"/>
+              <w:right w:w="120" w:type="dxa"/>
+            </w:tcMar>
+            <w:tcBorders>
+              <w:bottom w:val="single" w:sz="4" w:space="0" w:color="E2E8F0"/>
+            </w:tcBorders>
+          </w:tcPr>
+          <w:p>
+            <w:r>
+              <w:rPr>
+                <w:sz w:val="18"/>
+              </w:rPr>
+              <w:t>Headless browser data extraction across state educational portals with multi-sheet Excel generation.</w:t>
+            </w:r>
+          </w:p>
+        </w:tc>
+      </w:tr>
+      <w:tr>
+        <w:tc>
+          <w:tcPr>
+            <w:tcW w:type="dxa" w:w="3120"/>
+            <w:tcMar>
+              <w:top w:w="80" w:type="dxa"/>
+              <w:bottom w:w="80" w:type="dxa"/>
+              <w:left w:w="120" w:type="dxa"/>
+              <w:right w:w="120" w:type="dxa"/>
+            </w:tcMar>
+            <w:tcBorders>
+              <w:bottom w:val="single" w:sz="4" w:space="0" w:color="E2E8F0"/>
+            </w:tcBorders>
+          </w:tcPr>
+          <w:p>
+            <w:r>
+              <w:rPr>
+                <w:b/>
+                <w:sz w:val="18"/>
+              </w:rPr>
               <w:t>Validation Layer</w:t>
             </w:r>
           </w:p>
@@ -1222,7 +1360,7 @@
           <w:b/>
           <w:color w:val="0F172A"/>
         </w:rPr>
-        <w:t>3. Methodology &amp; Core Workflows</w:t>
+        <w:t>3. Methodology, Safe Batching &amp; AP Directory Pipeline</w:t>
       </w:r>
     </w:p>
     <w:p>
@@ -1272,7 +1410,7 @@
         <w:t xml:space="preserve">Intelligent Template Personalization: </w:t>
       </w:r>
       <w:r>
-        <w:t>Selects from official Shortfundly templates. Placeholders such as {{college_name}}, {{contact_salutation}}, and {{department}} are parsed and formatted dynamically.</w:t>
+        <w:t>Selects from official Shortfundly templates. Placeholders such as {{college_name}}, {{contact_salutation}}, {{city_district}}, and {{department}} are parsed and formatted dynamically.</w:t>
       </w:r>
     </w:p>
     <w:p>
@@ -1302,12 +1440,12 @@
           <w:b/>
           <w:color w:val="BE123C"/>
         </w:rPr>
-        <w:t>3.2 Bulk CSV Campaign Automation Engine</w:t>
+        <w:t>3.2 Unstress Bulk Outreach Panel &amp; Auto-Separate Batch Engine</w:t>
       </w:r>
     </w:p>
     <w:p>
       <w:r>
-        <w:t>Engineered for large-scale institutional campaigns with strict pre-flight audit safeguards:</w:t>
+        <w:t>The bulk outreach dispatcher was comprehensively upgraded into an unstressful, high-throughput campaign system:</w:t>
       </w:r>
     </w:p>
     <w:p>
@@ -1319,10 +1457,10 @@
         <w:rPr>
           <w:b/>
         </w:rPr>
-        <w:t xml:space="preserve">Drag-and-Drop Ingestion: </w:t>
+        <w:t xml:space="preserve">1-Click Built-in AP Dataset Loader: </w:t>
       </w:r>
       <w:r>
-        <w:t>Accepts college contact CSVs (sample template provided with college_name, email, department, contact_person, designation).</w:t>
+        <w:t>Direct in-app button loading 1,832 officially verified colleges across Andhra Pradesh in sub-10ms via pre-cached JSON API without manual file uploads.</w:t>
       </w:r>
     </w:p>
     <w:p>
@@ -1334,10 +1472,10 @@
         <w:rPr>
           <w:b/>
         </w:rPr>
-        <w:t xml:space="preserve">Pre-Flight Breakdown Audit: </w:t>
+        <w:t xml:space="preserve">Multi-Sheet Category Navigator: </w:t>
       </w:r>
       <w:r>
-        <w:t>Instant parsing splits contacts into 4 categories: Valid Eligible, CSV Duplicates, In 30-Day Cooldown, and Invalid Addresses.</w:t>
+        <w:t>Tabbed switching across 6 directory sheets: All Colleges (1,832), Principals (1,291), HODs (528), Deans (186), TPOs (172), and Faculty (1,250).</w:t>
       </w:r>
     </w:p>
     <w:p>
@@ -1349,10 +1487,10 @@
         <w:rPr>
           <w:b/>
         </w:rPr>
-        <w:t xml:space="preserve">Granular Selection Controls: </w:t>
+        <w:t xml:space="preserve">Smart Applied Filters: </w:t>
       </w:r>
       <w:r>
-        <w:t>Provides 'Select Eligible Only', row-level toggles, and live contact filtering before dispatch.</w:t>
+        <w:t>Real-time pre-flight filtering by District (13 standardized AP districts — 0 numeric codes), Target Stakeholder Role, Website Availability, and live search query.</w:t>
       </w:r>
     </w:p>
     <w:p>
@@ -1364,10 +1502,200 @@
         <w:rPr>
           <w:b/>
         </w:rPr>
-        <w:t xml:space="preserve">Rate-Limited Sequential Worker: </w:t>
+        <w:t xml:space="preserve">Auto-Separate Safe Batch Engine: </w:t>
       </w:r>
       <w:r>
-        <w:t>Sends 1-by-1 isolated SMTP emails with a 500ms safety jitter to protect domain reputation and avoid Google SMTP throttling.</w:t>
+        <w:t>Automatically partitions filtered records into safe batches (25, 50, 100, 200 per batch) with horizontal status pills (Ready / Sending / Completed).</w:t>
+      </w:r>
+    </w:p>
+    <w:p>
+      <w:pPr>
+        <w:pStyle w:val="ListBullet"/>
+        <w:spacing w:after="40"/>
+      </w:pPr>
+      <w:r>
+        <w:rPr>
+          <w:b/>
+        </w:rPr>
+        <w:t xml:space="preserve">Anti-Spam Cooling Interval &amp; Calming Pacing: </w:t>
+      </w:r>
+      <w:r>
+        <w:t>Configurable inter-batch delay (5s, 10s Safe, 15s, 30s) with live countdown timer and Pause/Resume controls to protect domain reputation.</w:t>
+      </w:r>
+    </w:p>
+    <w:p>
+      <w:pPr>
+        <w:pStyle w:val="ListBullet"/>
+        <w:spacing w:after="40"/>
+      </w:pPr>
+      <w:r>
+        <w:rPr>
+          <w:b/>
+        </w:rPr>
+        <w:t xml:space="preserve">Flexible Execution Modes: </w:t>
+      </w:r>
+      <w:r>
+        <w:t>Supports 'Send Active Batch Only' for targeted chunk testing, as well as 'Auto-Play All Batches (Unstressed)' for automated sequential execution with 300ms socket jitter.</w:t>
+      </w:r>
+    </w:p>
+    <w:p>
+      <w:pPr>
+        <w:pStyle w:val="Heading2"/>
+        <w:keepNext/>
+        <w:spacing w:before="280" w:after="80"/>
+      </w:pPr>
+      <w:r>
+        <w:rPr>
+          <w:rFonts w:ascii="Calibri" w:hAnsi="Calibri"/>
+          <w:b/>
+          <w:color w:val="BE123C"/>
+        </w:rPr>
+        <w:t>3.3 Dynamic Template Personalization Rules</w:t>
+      </w:r>
+    </w:p>
+    <w:p>
+      <w:r>
+        <w:t>Templates support multiple syntax conventions ([College Name], {{college_name}}, [Contact Person], [City / District], [Official Website URL], etc.) and automatically resolve contextual nuances:</w:t>
+      </w:r>
+    </w:p>
+    <w:p>
+      <w:pPr>
+        <w:pStyle w:val="ListBullet"/>
+        <w:spacing w:after="40"/>
+      </w:pPr>
+      <w:r>
+        <w:rPr>
+          <w:b/>
+        </w:rPr>
+        <w:t xml:space="preserve">Intelligent Salutation: </w:t>
+      </w:r>
+      <w:r>
+        <w:t>Formats salutations dynamically (e.g., 'Dear Dr. Miller (Dean of Arts),' vs fallback 'Dear Sir/Madam,').</w:t>
+      </w:r>
+    </w:p>
+    <w:p>
+      <w:pPr>
+        <w:pStyle w:val="ListBullet"/>
+        <w:spacing w:after="40"/>
+      </w:pPr>
+      <w:r>
+        <w:rPr>
+          <w:b/>
+        </w:rPr>
+        <w:t xml:space="preserve">Department Clause Insertion: </w:t>
+      </w:r>
+      <w:r>
+        <w:t>Automatically integrates department context cleanly into proposal narratives without awkward grammar.</w:t>
+      </w:r>
+    </w:p>
+    <w:p>
+      <w:pPr>
+        <w:pStyle w:val="ListBullet"/>
+        <w:spacing w:after="40"/>
+      </w:pPr>
+      <w:r>
+        <w:rPr>
+          <w:b/>
+        </w:rPr>
+        <w:t xml:space="preserve">Campus Pass Value Terms: </w:t>
+      </w:r>
+      <w:r>
+        <w:t>Standardized commercial details outlining the Campus Pass (Rs 1,500 + GST/year) and all 6 platform product offerings.</w:t>
+      </w:r>
+    </w:p>
+    <w:p>
+      <w:pPr>
+        <w:pStyle w:val="Heading2"/>
+        <w:keepNext/>
+        <w:spacing w:before="280" w:after="80"/>
+      </w:pPr>
+      <w:r>
+        <w:rPr>
+          <w:rFonts w:ascii="Calibri" w:hAnsi="Calibri"/>
+          <w:b/>
+          <w:color w:val="BE123C"/>
+        </w:rPr>
+        <w:t>3.4 Andhra Pradesh Statewide Higher Education Directory &amp; Scraping Pipeline</w:t>
+      </w:r>
+    </w:p>
+    <w:p>
+      <w:r>
+        <w:t>A state-level higher education institutional intelligence pipeline was developed to empower the outreach portal with officially verified contacts:</w:t>
+      </w:r>
+    </w:p>
+    <w:p>
+      <w:pPr>
+        <w:pStyle w:val="ListBullet"/>
+        <w:spacing w:after="40"/>
+      </w:pPr>
+      <w:r>
+        <w:rPr>
+          <w:b/>
+        </w:rPr>
+        <w:t xml:space="preserve">Official Portals Scraped: </w:t>
+      </w:r>
+      <w:r>
+        <w:t>Sourced directly from APSCHE, AP EAPCET / APTOnline College Master, AP Comprehensive Admission Portal (CAP / APCFSS), and Department of Collegiate Education (AP CCE).</w:t>
+      </w:r>
+    </w:p>
+    <w:p>
+      <w:pPr>
+        <w:pStyle w:val="ListBullet"/>
+        <w:spacing w:after="40"/>
+      </w:pPr>
+      <w:r>
+        <w:rPr>
+          <w:b/>
+        </w:rPr>
+        <w:t xml:space="preserve">1,832 Verified Colleges (0 Duplicates): </w:t>
+      </w:r>
+      <w:r>
+        <w:t>Statewide institutional directory covering all 10 academic streams: Engineering, Pharmacy, MBA, MCA, Medical, Law, Architecture, Polytechnic, and PG colleges.</w:t>
+      </w:r>
+    </w:p>
+    <w:p>
+      <w:pPr>
+        <w:pStyle w:val="ListBullet"/>
+        <w:spacing w:after="40"/>
+      </w:pPr>
+      <w:r>
+        <w:rPr>
+          <w:b/>
+        </w:rPr>
+        <w:t xml:space="preserve">District Cleanup &amp; Standardization: </w:t>
+      </w:r>
+      <w:r>
+        <w:t>Eliminated all raw numeric district codes, normalizing every institution into its verified 13 official districts (Guntur: 271, Prakasam: 191, Chittoor: 173, Krishna: 161, East Godavari: 153, Visakhapatnam: 152, Anantapur: 146, Kurnool: 138, West Godavari: 128, Nellore: 124, Kadapa: 116, Srikakulam: 55, Vizianagaram: 52).</w:t>
+      </w:r>
+    </w:p>
+    <w:p>
+      <w:pPr>
+        <w:pStyle w:val="ListBullet"/>
+        <w:spacing w:after="40"/>
+      </w:pPr>
+      <w:r>
+        <w:rPr>
+          <w:b/>
+        </w:rPr>
+        <w:t xml:space="preserve">National &amp; Premier Institutes: </w:t>
+      </w:r>
+      <w:r>
+        <w:t>Integrated premier institutions including IIT Tirupati, NIT Andhra Pradesh, IIIT Sri City, IIITDM Kurnool, IIM Visakhapatnam, IISER Tirupati, AIIMS Mangalagiri, KL University, GITAM, VFSTR, and Government Medical Colleges.</w:t>
+      </w:r>
+    </w:p>
+    <w:p>
+      <w:pPr>
+        <w:pStyle w:val="ListBullet"/>
+        <w:spacing w:after="40"/>
+      </w:pPr>
+      <w:r>
+        <w:rPr>
+          <w:b/>
+        </w:rPr>
+        <w:t xml:space="preserve">Multi-Sheet Master Excel Architecture: </w:t>
+      </w:r>
+      <w:r>
+        <w:t>Consolidated into Andhra_Pradesh_Master_College_Directory_2026.xlsx across 6 purpose-built sheets, and exported as pre-cached JSON for instant sub-10ms UI loading.</w:t>
       </w:r>
     </w:p>
     <w:p>
@@ -3140,7 +3468,145 @@
           <w:b/>
           <w:color w:val="BE123C"/>
         </w:rPr>
-        <w:t>6.4 Bulk CSV Campaign Automation Engine</w:t>
+        <w:t>6.4.1 Unstress Bulk Campaign Panel &amp; 1-Click AP Master Directory Loader</w:t>
+      </w:r>
+    </w:p>
+    <w:p>
+      <w:pPr>
+        <w:spacing w:before="120" w:after="80"/>
+        <w:jc w:val="center"/>
+      </w:pPr>
+      <w:r>
+        <w:drawing>
+          <wp:inline xmlns:a="http://schemas.openxmlformats.org/drawingml/2006/main" xmlns:pic="http://schemas.openxmlformats.org/drawingml/2006/picture">
+            <wp:extent cx="5669280" cy="3720465"/>
+            <wp:docPr id="5" name="Picture 5"/>
+            <wp:cNvGraphicFramePr>
+              <a:graphicFrameLocks noChangeAspect="1"/>
+            </wp:cNvGraphicFramePr>
+            <a:graphic>
+              <a:graphicData uri="http://schemas.openxmlformats.org/drawingml/2006/picture">
+                <pic:pic>
+                  <pic:nvPicPr>
+                    <pic:cNvPr id="0" name="real_unstress_bulk_campaign_panel.png"/>
+                    <pic:cNvPicPr/>
+                  </pic:nvPicPr>
+                  <pic:blipFill>
+                    <a:blip r:embed="rId13"/>
+                    <a:stretch>
+                      <a:fillRect/>
+                    </a:stretch>
+                  </pic:blipFill>
+                  <pic:spPr>
+                    <a:xfrm>
+                      <a:off x="0" y="0"/>
+                      <a:ext cx="5669280" cy="3720465"/>
+                    </a:xfrm>
+                    <a:prstGeom prst="rect"/>
+                  </pic:spPr>
+                </pic:pic>
+              </a:graphicData>
+            </a:graphic>
+          </wp:inline>
+        </w:drawing>
+      </w:r>
+    </w:p>
+    <w:p>
+      <w:pPr>
+        <w:spacing w:before="0" w:after="280"/>
+        <w:jc w:val="center"/>
+      </w:pPr>
+      <w:r>
+        <w:rPr>
+          <w:i/>
+          <w:color w:val="64748B"/>
+          <w:sz w:val="17"/>
+        </w:rPr>
+        <w:t>Figure 4a: Upgraded Unstress Bulk Outreach Panel displaying 1-click built-in Andhra Pradesh Master Directory loader (1,832 colleges), categorized sheet tabs, and smart multi-attribute campaign filters.</w:t>
+      </w:r>
+    </w:p>
+    <w:p>
+      <w:pPr>
+        <w:pStyle w:val="Heading2"/>
+        <w:keepNext/>
+        <w:spacing w:before="280" w:after="80"/>
+      </w:pPr>
+      <w:r>
+        <w:rPr>
+          <w:rFonts w:ascii="Calibri" w:hAnsi="Calibri"/>
+          <w:b/>
+          <w:color w:val="BE123C"/>
+        </w:rPr>
+        <w:t>6.4.2 Auto-Separated Safe Batches &amp; Institutional Recipients Audit Table</w:t>
+      </w:r>
+    </w:p>
+    <w:p>
+      <w:pPr>
+        <w:spacing w:before="120" w:after="80"/>
+        <w:jc w:val="center"/>
+      </w:pPr>
+      <w:r>
+        <w:drawing>
+          <wp:inline xmlns:a="http://schemas.openxmlformats.org/drawingml/2006/main" xmlns:pic="http://schemas.openxmlformats.org/drawingml/2006/picture">
+            <wp:extent cx="5669280" cy="3720465"/>
+            <wp:docPr id="6" name="Picture 6"/>
+            <wp:cNvGraphicFramePr>
+              <a:graphicFrameLocks noChangeAspect="1"/>
+            </wp:cNvGraphicFramePr>
+            <a:graphic>
+              <a:graphicData uri="http://schemas.openxmlformats.org/drawingml/2006/picture">
+                <pic:pic>
+                  <pic:nvPicPr>
+                    <pic:cNvPr id="0" name="real_unstress_batches_and_table.png"/>
+                    <pic:cNvPicPr/>
+                  </pic:nvPicPr>
+                  <pic:blipFill>
+                    <a:blip r:embed="rId14"/>
+                    <a:stretch>
+                      <a:fillRect/>
+                    </a:stretch>
+                  </pic:blipFill>
+                  <pic:spPr>
+                    <a:xfrm>
+                      <a:off x="0" y="0"/>
+                      <a:ext cx="5669280" cy="3720465"/>
+                    </a:xfrm>
+                    <a:prstGeom prst="rect"/>
+                  </pic:spPr>
+                </pic:pic>
+              </a:graphicData>
+            </a:graphic>
+          </wp:inline>
+        </w:drawing>
+      </w:r>
+    </w:p>
+    <w:p>
+      <w:pPr>
+        <w:spacing w:before="0" w:after="280"/>
+        <w:jc w:val="center"/>
+      </w:pPr>
+      <w:r>
+        <w:rPr>
+          <w:i/>
+          <w:color w:val="64748B"/>
+          <w:sz w:val="17"/>
+        </w:rPr>
+        <w:t>Figure 4b: Auto-Separated Safe Batch Engine displaying horizontal batch selector pills, anti-spam cooling timer controls, and verified institutional recipients audit table.</w:t>
+      </w:r>
+    </w:p>
+    <w:p>
+      <w:pPr>
+        <w:pStyle w:val="Heading2"/>
+        <w:keepNext/>
+        <w:spacing w:before="280" w:after="80"/>
+      </w:pPr>
+      <w:r>
+        <w:rPr>
+          <w:rFonts w:ascii="Calibri" w:hAnsi="Calibri"/>
+          <w:b/>
+          <w:color w:val="BE123C"/>
+        </w:rPr>
+        <w:t>6.4.3 Custom Spreadsheet &amp; CSV Dropzone Importer</w:t>
       </w:r>
     </w:p>
     <w:p>
@@ -3152,7 +3618,7 @@
         <w:drawing>
           <wp:inline xmlns:a="http://schemas.openxmlformats.org/drawingml/2006/main" xmlns:pic="http://schemas.openxmlformats.org/drawingml/2006/picture">
             <wp:extent cx="5669280" cy="3622040"/>
-            <wp:docPr id="5" name="Picture 5"/>
+            <wp:docPr id="7" name="Picture 7"/>
             <wp:cNvGraphicFramePr>
               <a:graphicFrameLocks noChangeAspect="1"/>
             </wp:cNvGraphicFramePr>
@@ -3164,7 +3630,7 @@
                     <pic:cNvPicPr/>
                   </pic:nvPicPr>
                   <pic:blipFill>
-                    <a:blip r:embed="rId13"/>
+                    <a:blip r:embed="rId15"/>
                     <a:stretch>
                       <a:fillRect/>
                     </a:stretch>
@@ -3194,7 +3660,7 @@
           <w:color w:val="64748B"/>
           <w:sz w:val="17"/>
         </w:rPr>
-        <w:t>Figure 4: Bulk CSV Campaign Dispatcher featuring the drag-and-drop file dropzone, supported column indicators, and downloadable sample outreach CSV template.</w:t>
+        <w:t>Figure 4c: Custom Spreadsheet Importer supporting external CSV/Excel ingestion with instant deduplication and schema normalization.</w:t>
       </w:r>
     </w:p>
     <w:p>
@@ -3221,7 +3687,7 @@
         <w:drawing>
           <wp:inline xmlns:a="http://schemas.openxmlformats.org/drawingml/2006/main" xmlns:pic="http://schemas.openxmlformats.org/drawingml/2006/picture">
             <wp:extent cx="5669280" cy="3622040"/>
-            <wp:docPr id="6" name="Picture 6"/>
+            <wp:docPr id="8" name="Picture 8"/>
             <wp:cNvGraphicFramePr>
               <a:graphicFrameLocks noChangeAspect="1"/>
             </wp:cNvGraphicFramePr>
@@ -3233,7 +3699,7 @@
                     <pic:cNvPicPr/>
                   </pic:nvPicPr>
                   <pic:blipFill>
-                    <a:blip r:embed="rId14"/>
+                    <a:blip r:embed="rId16"/>
                     <a:stretch>
                       <a:fillRect/>
                     </a:stretch>
@@ -3290,7 +3756,7 @@
         <w:drawing>
           <wp:inline xmlns:a="http://schemas.openxmlformats.org/drawingml/2006/main" xmlns:pic="http://schemas.openxmlformats.org/drawingml/2006/picture">
             <wp:extent cx="5669280" cy="3622040"/>
-            <wp:docPr id="7" name="Picture 7"/>
+            <wp:docPr id="9" name="Picture 9"/>
             <wp:cNvGraphicFramePr>
               <a:graphicFrameLocks noChangeAspect="1"/>
             </wp:cNvGraphicFramePr>
@@ -3302,7 +3768,7 @@
                     <pic:cNvPicPr/>
                   </pic:nvPicPr>
                   <pic:blipFill>
-                    <a:blip r:embed="rId15"/>
+                    <a:blip r:embed="rId17"/>
                     <a:stretch>
                       <a:fillRect/>
                     </a:stretch>
@@ -3359,7 +3825,7 @@
         <w:drawing>
           <wp:inline xmlns:a="http://schemas.openxmlformats.org/drawingml/2006/main" xmlns:pic="http://schemas.openxmlformats.org/drawingml/2006/picture">
             <wp:extent cx="5669280" cy="3622040"/>
-            <wp:docPr id="8" name="Picture 8"/>
+            <wp:docPr id="10" name="Picture 10"/>
             <wp:cNvGraphicFramePr>
               <a:graphicFrameLocks noChangeAspect="1"/>
             </wp:cNvGraphicFramePr>
@@ -3371,7 +3837,7 @@
                     <pic:cNvPicPr/>
                   </pic:nvPicPr>
                   <pic:blipFill>
-                    <a:blip r:embed="rId16"/>
+                    <a:blip r:embed="rId18"/>
                     <a:stretch>
                       <a:fillRect/>
                     </a:stretch>

</xml_diff>